<commit_message>
feat(Version10): add P2.5.1–P2.5.3 vision candidate pipeline and Claude pilot
Complete quantity-intent through Claude Vision interpretation pilot on the frozen 14 OCR stirrup candidates, with validation, metrics, and production firewall isolation.

Co-authored-by: Cursor <cursoragent@cursor.com>
</commit_message>
<xml_diff>
--- a/Version9/data/output/PhaseQA2B2_accuracy_report/Overall_Accuracy_Report_V9.6.1.docx
+++ b/Version9/data/output/PhaseQA2B2_accuracy_report/Overall_Accuracy_Report_V9.6.1.docx
@@ -66,28 +66,25 @@
     </w:p>
     <w:p>
       <w:r>
-        <w:rPr>
-          <w:b w:val="0"/>
-        </w:rPr>
         <w:t>The following table compares the Version 8.9.1 baseline benchmark against the Version 9.6.1 results from QA.2B.1 regenerated production outputs.</w:t>
       </w:r>
     </w:p>
     <w:tbl>
       <w:tblPr>
         <w:tblStyle w:val="TableGrid"/>
-        <w:tblW w:type="auto" w:w="0"/>
-        <w:tblLook w:firstColumn="1" w:firstRow="1" w:lastColumn="0" w:lastRow="0" w:noHBand="0" w:noVBand="1" w:val="04A0"/>
+        <w:tblW w:w="0" w:type="auto"/>
+        <w:tblLook w:val="04A0" w:firstRow="1" w:lastRow="0" w:firstColumn="1" w:lastColumn="0" w:noHBand="0" w:noVBand="1"/>
       </w:tblPr>
       <w:tblGrid>
-        <w:gridCol w:w="2256"/>
-        <w:gridCol w:w="2256"/>
-        <w:gridCol w:w="2256"/>
-        <w:gridCol w:w="2256"/>
+        <w:gridCol w:w="2253"/>
+        <w:gridCol w:w="2254"/>
+        <w:gridCol w:w="2254"/>
+        <w:gridCol w:w="2255"/>
       </w:tblGrid>
       <w:tr>
         <w:tc>
           <w:tcPr>
-            <w:tcW w:type="dxa" w:w="2256"/>
+            <w:tcW w:w="2253" w:type="dxa"/>
           </w:tcPr>
           <w:p>
             <w:r>
@@ -100,7 +97,7 @@
         </w:tc>
         <w:tc>
           <w:tcPr>
-            <w:tcW w:type="dxa" w:w="2256"/>
+            <w:tcW w:w="2254" w:type="dxa"/>
           </w:tcPr>
           <w:p>
             <w:r>
@@ -113,7 +110,7 @@
         </w:tc>
         <w:tc>
           <w:tcPr>
-            <w:tcW w:type="dxa" w:w="2256"/>
+            <w:tcW w:w="2254" w:type="dxa"/>
           </w:tcPr>
           <w:p>
             <w:r>
@@ -126,7 +123,7 @@
         </w:tc>
         <w:tc>
           <w:tcPr>
-            <w:tcW w:type="dxa" w:w="2256"/>
+            <w:tcW w:w="2255" w:type="dxa"/>
           </w:tcPr>
           <w:p>
             <w:r>
@@ -141,7 +138,7 @@
       <w:tr>
         <w:tc>
           <w:tcPr>
-            <w:tcW w:type="dxa" w:w="2256"/>
+            <w:tcW w:w="2253" w:type="dxa"/>
           </w:tcPr>
           <w:p>
             <w:r>
@@ -154,39 +151,30 @@
         </w:tc>
         <w:tc>
           <w:tcPr>
-            <w:tcW w:type="dxa" w:w="2256"/>
-          </w:tcPr>
-          <w:p>
-            <w:r>
-              <w:rPr>
-                <w:b w:val="0"/>
-              </w:rPr>
+            <w:tcW w:w="2254" w:type="dxa"/>
+          </w:tcPr>
+          <w:p>
+            <w:r>
               <w:t>93.92%</w:t>
             </w:r>
           </w:p>
         </w:tc>
         <w:tc>
           <w:tcPr>
-            <w:tcW w:type="dxa" w:w="2256"/>
-          </w:tcPr>
-          <w:p>
-            <w:r>
-              <w:rPr>
-                <w:b w:val="0"/>
-              </w:rPr>
+            <w:tcW w:w="2254" w:type="dxa"/>
+          </w:tcPr>
+          <w:p>
+            <w:r>
               <w:t>93.92%</w:t>
             </w:r>
           </w:p>
         </w:tc>
         <w:tc>
           <w:tcPr>
-            <w:tcW w:type="dxa" w:w="2256"/>
-          </w:tcPr>
-          <w:p>
-            <w:r>
-              <w:rPr>
-                <w:b w:val="0"/>
-              </w:rPr>
+            <w:tcW w:w="2255" w:type="dxa"/>
+          </w:tcPr>
+          <w:p>
+            <w:r>
               <w:t>+0.00%</w:t>
             </w:r>
           </w:p>
@@ -195,12 +183,14 @@
       <w:tr>
         <w:tc>
           <w:tcPr>
-            <w:tcW w:type="dxa" w:w="2256"/>
-          </w:tcPr>
-          <w:p>
-            <w:r>
-              <w:rPr>
-                <w:b/>
+            <w:tcW w:w="2253" w:type="dxa"/>
+            <w:shd w:val="clear" w:color="auto" w:fill="00B050"/>
+          </w:tcPr>
+          <w:p>
+            <w:r>
+              <w:rPr>
+                <w:b/>
+                <w:color w:val="000000" w:themeColor="text1"/>
               </w:rPr>
               <w:t>Bar Detection</w:t>
             </w:r>
@@ -208,25 +198,30 @@
         </w:tc>
         <w:tc>
           <w:tcPr>
-            <w:tcW w:type="dxa" w:w="2256"/>
-          </w:tcPr>
-          <w:p>
-            <w:r>
-              <w:rPr>
-                <w:b w:val="0"/>
-              </w:rPr>
+            <w:tcW w:w="2254" w:type="dxa"/>
+          </w:tcPr>
+          <w:p>
+            <w:r>
               <w:t>41.52%</w:t>
             </w:r>
           </w:p>
         </w:tc>
         <w:tc>
           <w:tcPr>
-            <w:tcW w:type="dxa" w:w="2256"/>
-          </w:tcPr>
-          <w:p>
-            <w:r>
-              <w:rPr>
-                <w:b w:val="0"/>
+            <w:tcW w:w="2254" w:type="dxa"/>
+          </w:tcPr>
+          <w:p>
+            <w:pPr>
+              <w:rPr>
+                <w:b/>
+                <w:bCs/>
+              </w:rPr>
+            </w:pPr>
+            <w:r>
+              <w:rPr>
+                <w:b/>
+                <w:bCs/>
+                <w:color w:val="00B050"/>
               </w:rPr>
               <w:t>68.52%</w:t>
             </w:r>
@@ -234,12 +229,11 @@
         </w:tc>
         <w:tc>
           <w:tcPr>
-            <w:tcW w:type="dxa" w:w="2256"/>
-          </w:tcPr>
-          <w:p>
-            <w:r>
-              <w:rPr>
-                <w:b w:val="0"/>
+            <w:tcW w:w="2255" w:type="dxa"/>
+          </w:tcPr>
+          <w:p>
+            <w:r>
+              <w:rPr>
                 <w:color w:val="008000"/>
               </w:rPr>
               <w:t>+27.00%</w:t>
@@ -250,7 +244,7 @@
       <w:tr>
         <w:tc>
           <w:tcPr>
-            <w:tcW w:type="dxa" w:w="2256"/>
+            <w:tcW w:w="2253" w:type="dxa"/>
           </w:tcPr>
           <w:p>
             <w:r>
@@ -263,157 +257,46 @@
         </w:tc>
         <w:tc>
           <w:tcPr>
-            <w:tcW w:type="dxa" w:w="2256"/>
-          </w:tcPr>
-          <w:p>
-            <w:r>
-              <w:rPr>
-                <w:b w:val="0"/>
-              </w:rPr>
+            <w:tcW w:w="2254" w:type="dxa"/>
+          </w:tcPr>
+          <w:p>
+            <w:r>
               <w:t>24.16%</w:t>
             </w:r>
           </w:p>
         </w:tc>
         <w:tc>
           <w:tcPr>
-            <w:tcW w:type="dxa" w:w="2256"/>
-          </w:tcPr>
-          <w:p>
-            <w:r>
-              <w:rPr>
-                <w:b w:val="0"/>
-              </w:rPr>
+            <w:tcW w:w="2254" w:type="dxa"/>
+          </w:tcPr>
+          <w:p>
+            <w:r>
               <w:t>27.41%</w:t>
             </w:r>
           </w:p>
         </w:tc>
         <w:tc>
           <w:tcPr>
-            <w:tcW w:type="dxa" w:w="2256"/>
-          </w:tcPr>
-          <w:p>
-            <w:r>
-              <w:rPr>
-                <w:b w:val="0"/>
+            <w:tcW w:w="2255" w:type="dxa"/>
+          </w:tcPr>
+          <w:p>
+            <w:r>
+              <w:rPr>
                 <w:color w:val="008000"/>
               </w:rPr>
               <w:t>+3.25%</w:t>
-            </w:r>
-          </w:p>
-        </w:tc>
-      </w:tr>
-      <w:tr>
-        <w:tc>
-          <w:tcPr>
-            <w:tcW w:type="dxa" w:w="2256"/>
-          </w:tcPr>
-          <w:p>
-            <w:r>
-              <w:rPr>
-                <w:b/>
-              </w:rPr>
-              <w:t>Steel Accuracy</w:t>
-            </w:r>
-          </w:p>
-        </w:tc>
-        <w:tc>
-          <w:tcPr>
-            <w:tcW w:type="dxa" w:w="2256"/>
-          </w:tcPr>
-          <w:p>
-            <w:r>
-              <w:rPr>
-                <w:b w:val="0"/>
-              </w:rPr>
-              <w:t>72.69%</w:t>
-            </w:r>
-          </w:p>
-        </w:tc>
-        <w:tc>
-          <w:tcPr>
-            <w:tcW w:type="dxa" w:w="2256"/>
-          </w:tcPr>
-          <w:p>
-            <w:r>
-              <w:rPr>
-                <w:b w:val="0"/>
-              </w:rPr>
-              <w:t>91.07%</w:t>
-            </w:r>
-          </w:p>
-        </w:tc>
-        <w:tc>
-          <w:tcPr>
-            <w:tcW w:type="dxa" w:w="2256"/>
-          </w:tcPr>
-          <w:p>
-            <w:r>
-              <w:rPr>
-                <w:b w:val="0"/>
-                <w:color w:val="008000"/>
-              </w:rPr>
-              <w:t>+18.38%</w:t>
-            </w:r>
-          </w:p>
-        </w:tc>
-      </w:tr>
-      <w:tr>
-        <w:tc>
-          <w:tcPr>
-            <w:tcW w:type="dxa" w:w="2256"/>
-          </w:tcPr>
-          <w:p>
-            <w:r>
-              <w:rPr>
-                <w:b/>
-              </w:rPr>
-              <w:t>Overall Accuracy</w:t>
-            </w:r>
-          </w:p>
-        </w:tc>
-        <w:tc>
-          <w:tcPr>
-            <w:tcW w:type="dxa" w:w="2256"/>
-          </w:tcPr>
-          <w:p>
-            <w:r>
-              <w:rPr>
-                <w:b w:val="0"/>
-              </w:rPr>
-              <w:t>58.07%</w:t>
-            </w:r>
-          </w:p>
-        </w:tc>
-        <w:tc>
-          <w:tcPr>
-            <w:tcW w:type="dxa" w:w="2256"/>
-          </w:tcPr>
-          <w:p>
-            <w:r>
-              <w:rPr>
-                <w:b w:val="0"/>
-              </w:rPr>
-              <w:t>70.23%</w:t>
-            </w:r>
-          </w:p>
-        </w:tc>
-        <w:tc>
-          <w:tcPr>
-            <w:tcW w:type="dxa" w:w="2256"/>
-          </w:tcPr>
-          <w:p>
-            <w:r>
-              <w:rPr>
-                <w:b w:val="0"/>
-                <w:color w:val="008000"/>
-              </w:rPr>
-              <w:t>+12.16%</w:t>
             </w:r>
           </w:p>
         </w:tc>
       </w:tr>
     </w:tbl>
-    <w:p/>
+    <w:p>
+      <w:pPr>
+        <w:rPr>
+          <w:b/>
+        </w:rPr>
+      </w:pPr>
+    </w:p>
     <w:p>
       <w:pPr>
         <w:rPr>
@@ -439,6 +322,7 @@
         <w:gridCol w:w="2161"/>
         <w:gridCol w:w="1701"/>
         <w:gridCol w:w="1547"/>
+        <w:gridCol w:w="1547"/>
       </w:tblGrid>
       <w:tr>
         <w:tc>
@@ -556,9 +440,6 @@
               </w:rPr>
             </w:pPr>
             <w:r>
-              <w:rPr>
-                <w:b w:val="0"/>
-              </w:rPr>
               <w:t>First Set</w:t>
             </w:r>
           </w:p>
@@ -576,9 +457,6 @@
               </w:rPr>
             </w:pPr>
             <w:r>
-              <w:rPr>
-                <w:b w:val="0"/>
-              </w:rPr>
               <w:t>18 / 18 (100.0%)</w:t>
             </w:r>
           </w:p>
@@ -596,9 +474,6 @@
               </w:rPr>
             </w:pPr>
             <w:r>
-              <w:rPr>
-                <w:b w:val="0"/>
-              </w:rPr>
               <w:t>81.18%</w:t>
             </w:r>
           </w:p>
@@ -618,7 +493,6 @@
             </w:pPr>
             <w:r>
               <w:rPr>
-                <w:b w:val="0"/>
                 <w:color w:val="EE0000"/>
               </w:rPr>
               <w:t>34.78%</w:t>
@@ -639,9 +513,6 @@
               </w:rPr>
             </w:pPr>
             <w:r>
-              <w:rPr>
-                <w:b w:val="0"/>
-              </w:rPr>
               <w:t>99.83%</w:t>
             </w:r>
           </w:p>
@@ -661,9 +532,6 @@
               </w:rPr>
             </w:pPr>
             <w:r>
-              <w:rPr>
-                <w:b w:val="0"/>
-              </w:rPr>
               <w:t>Second Set</w:t>
             </w:r>
           </w:p>
@@ -681,9 +549,6 @@
               </w:rPr>
             </w:pPr>
             <w:r>
-              <w:rPr>
-                <w:b w:val="0"/>
-              </w:rPr>
               <w:t>64 / 67 (95.5%)</w:t>
             </w:r>
           </w:p>
@@ -701,9 +566,6 @@
               </w:rPr>
             </w:pPr>
             <w:r>
-              <w:rPr>
-                <w:b w:val="0"/>
-              </w:rPr>
               <w:t>71.76%</w:t>
             </w:r>
           </w:p>
@@ -723,7 +585,6 @@
             </w:pPr>
             <w:r>
               <w:rPr>
-                <w:b w:val="0"/>
                 <w:color w:val="EE0000"/>
               </w:rPr>
               <w:t>35.74%</w:t>
@@ -744,9 +605,6 @@
               </w:rPr>
             </w:pPr>
             <w:r>
-              <w:rPr>
-                <w:b w:val="0"/>
-              </w:rPr>
               <w:t>85.50%</w:t>
             </w:r>
           </w:p>
@@ -766,9 +624,6 @@
               </w:rPr>
             </w:pPr>
             <w:r>
-              <w:rPr>
-                <w:b w:val="0"/>
-              </w:rPr>
               <w:t>Third Set</w:t>
             </w:r>
           </w:p>
@@ -786,9 +641,6 @@
               </w:rPr>
             </w:pPr>
             <w:r>
-              <w:rPr>
-                <w:b w:val="0"/>
-              </w:rPr>
               <w:t>57 / 63 (90.5%)</w:t>
             </w:r>
           </w:p>
@@ -806,9 +658,6 @@
               </w:rPr>
             </w:pPr>
             <w:r>
-              <w:rPr>
-                <w:b w:val="0"/>
-              </w:rPr>
               <w:t>63.52%</w:t>
             </w:r>
           </w:p>
@@ -828,7 +677,6 @@
             </w:pPr>
             <w:r>
               <w:rPr>
-                <w:b w:val="0"/>
                 <w:color w:val="EE0000"/>
               </w:rPr>
               <w:t>17.91%</w:t>
@@ -849,9 +697,6 @@
               </w:rPr>
             </w:pPr>
             <w:r>
-              <w:rPr>
-                <w:b w:val="0"/>
-              </w:rPr>
               <w:t>87.89%</w:t>
             </w:r>
           </w:p>
@@ -907,6 +752,7 @@
             <w:r>
               <w:rPr>
                 <w:b/>
+                <w:color w:val="00B050"/>
               </w:rPr>
               <w:t>68.52%</w:t>
             </w:r>
@@ -1043,13 +889,7 @@
         <w:rPr>
           <w:b/>
         </w:rPr>
-        <w:t xml:space="preserve">Beam Detection Accuracy: </w:t>
-      </w:r>
-      <w:r>
-        <w:rPr>
-          <w:b/>
-        </w:rPr>
-        <w:t>93.92%</w:t>
+        <w:t>Beam Detection Accuracy: 93.92%</w:t>
       </w:r>
     </w:p>
     <w:p>
@@ -1074,6 +914,7 @@
         </w:numPr>
       </w:pPr>
       <w:r>
+        <w:lastRenderedPageBreak/>
         <w:t xml:space="preserve">Ground Truth Bars: </w:t>
       </w:r>
       <w:r>
@@ -1145,13 +986,7 @@
         <w:rPr>
           <w:b/>
         </w:rPr>
-        <w:t xml:space="preserve">Bar Detection Accuracy: </w:t>
-      </w:r>
-      <w:r>
-        <w:rPr>
-          <w:b/>
-        </w:rPr>
-        <w:t>68.52%</w:t>
+        <w:t>Bar Detection Accuracy: 68.52%</w:t>
       </w:r>
     </w:p>
     <w:p>
@@ -1165,63 +1000,7 @@
         <w:rPr>
           <w:b/>
         </w:rPr>
-        <w:t xml:space="preserve">Bar Matching Accuracy: </w:t>
-      </w:r>
-      <w:r>
-        <w:rPr>
-          <w:b/>
-        </w:rPr>
-        <w:t>27.41%</w:t>
-      </w:r>
-    </w:p>
-    <w:p>
-      <w:pPr>
-        <w:rPr>
-          <w:b/>
-          <w:bCs/>
-        </w:rPr>
-      </w:pPr>
-      <w:r>
-        <w:rPr>
-          <w:b/>
-        </w:rPr>
-        <w:t>Steel Quantity Estimation</w:t>
-      </w:r>
-    </w:p>
-    <w:p>
-      <w:pPr>
-        <w:numPr>
-          <w:ilvl w:val="0"/>
-          <w:numId w:val="3"/>
-        </w:numPr>
-      </w:pPr>
-      <w:r>
-        <w:t>Average Steel Quantity Accuracy: 91.07%</w:t>
-      </w:r>
-    </w:p>
-    <w:p>
-      <w:pPr>
-        <w:rPr>
-          <w:b/>
-          <w:bCs/>
-        </w:rPr>
-      </w:pPr>
-      <w:r>
-        <w:rPr>
-          <w:b/>
-        </w:rPr>
-        <w:t>Overall Model Accuracy</w:t>
-      </w:r>
-    </w:p>
-    <w:p>
-      <w:pPr>
-        <w:numPr>
-          <w:ilvl w:val="0"/>
-          <w:numId w:val="4"/>
-        </w:numPr>
-      </w:pPr>
-      <w:r>
-        <w:t>Overall Ground Truth Benchmark Accuracy: 70.23%</w:t>
+        <w:t>Bar Matching Accuracy: 27.41%</w:t>
       </w:r>
     </w:p>
     <w:p/>
@@ -1251,13 +1030,13 @@
         <w:tblLook w:val="04A0" w:firstRow="1" w:lastRow="0" w:firstColumn="1" w:lastColumn="0" w:noHBand="0" w:noVBand="1"/>
       </w:tblPr>
       <w:tblGrid>
-        <w:gridCol w:w="4508"/>
-        <w:gridCol w:w="4508"/>
+        <w:gridCol w:w="3256"/>
+        <w:gridCol w:w="2268"/>
       </w:tblGrid>
       <w:tr>
         <w:tc>
           <w:tcPr>
-            <w:tcW w:w="4508" w:type="dxa"/>
+            <w:tcW w:w="3256" w:type="dxa"/>
             <w:vAlign w:val="center"/>
           </w:tcPr>
           <w:p>
@@ -1271,10 +1050,13 @@
         </w:tc>
         <w:tc>
           <w:tcPr>
-            <w:tcW w:w="4508" w:type="dxa"/>
-            <w:vAlign w:val="center"/>
-          </w:tcPr>
-          <w:p>
+            <w:tcW w:w="2268" w:type="dxa"/>
+            <w:vAlign w:val="center"/>
+          </w:tcPr>
+          <w:p>
+            <w:pPr>
+              <w:jc w:val="center"/>
+            </w:pPr>
             <w:r>
               <w:rPr>
                 <w:b/>
@@ -1287,28 +1069,25 @@
       <w:tr>
         <w:tc>
           <w:tcPr>
-            <w:tcW w:w="4508" w:type="dxa"/>
-            <w:vAlign w:val="center"/>
-          </w:tcPr>
-          <w:p>
-            <w:r>
-              <w:rPr>
-                <w:b w:val="0"/>
-              </w:rPr>
+            <w:tcW w:w="3256" w:type="dxa"/>
+            <w:vAlign w:val="center"/>
+          </w:tcPr>
+          <w:p>
+            <w:r>
               <w:t>Missing Bars</w:t>
             </w:r>
           </w:p>
         </w:tc>
         <w:tc>
           <w:tcPr>
-            <w:tcW w:w="4508" w:type="dxa"/>
-            <w:vAlign w:val="center"/>
-          </w:tcPr>
-          <w:p>
-            <w:r>
-              <w:rPr>
-                <w:b w:val="0"/>
-              </w:rPr>
+            <w:tcW w:w="2268" w:type="dxa"/>
+            <w:vAlign w:val="center"/>
+          </w:tcPr>
+          <w:p>
+            <w:pPr>
+              <w:jc w:val="center"/>
+            </w:pPr>
+            <w:r>
               <w:t>295</w:t>
             </w:r>
           </w:p>
@@ -1317,28 +1096,25 @@
       <w:tr>
         <w:tc>
           <w:tcPr>
-            <w:tcW w:w="4508" w:type="dxa"/>
-            <w:vAlign w:val="center"/>
-          </w:tcPr>
-          <w:p>
-            <w:r>
-              <w:rPr>
-                <w:b w:val="0"/>
-              </w:rPr>
+            <w:tcW w:w="3256" w:type="dxa"/>
+            <w:vAlign w:val="center"/>
+          </w:tcPr>
+          <w:p>
+            <w:r>
               <w:t>Wrong Quantity</w:t>
             </w:r>
           </w:p>
         </w:tc>
         <w:tc>
           <w:tcPr>
-            <w:tcW w:w="4508" w:type="dxa"/>
-            <w:vAlign w:val="center"/>
-          </w:tcPr>
-          <w:p>
-            <w:r>
-              <w:rPr>
-                <w:b w:val="0"/>
-              </w:rPr>
+            <w:tcW w:w="2268" w:type="dxa"/>
+            <w:vAlign w:val="center"/>
+          </w:tcPr>
+          <w:p>
+            <w:pPr>
+              <w:jc w:val="center"/>
+            </w:pPr>
+            <w:r>
               <w:t>215</w:t>
             </w:r>
           </w:p>
@@ -1347,28 +1123,25 @@
       <w:tr>
         <w:tc>
           <w:tcPr>
-            <w:tcW w:w="4508" w:type="dxa"/>
-            <w:vAlign w:val="center"/>
-          </w:tcPr>
-          <w:p>
-            <w:r>
-              <w:rPr>
-                <w:b w:val="0"/>
-              </w:rPr>
+            <w:tcW w:w="3256" w:type="dxa"/>
+            <w:vAlign w:val="center"/>
+          </w:tcPr>
+          <w:p>
+            <w:r>
               <w:t>Extra Bars</w:t>
             </w:r>
           </w:p>
         </w:tc>
         <w:tc>
           <w:tcPr>
-            <w:tcW w:w="4508" w:type="dxa"/>
-            <w:vAlign w:val="center"/>
-          </w:tcPr>
-          <w:p>
-            <w:r>
-              <w:rPr>
-                <w:b w:val="0"/>
-              </w:rPr>
+            <w:tcW w:w="2268" w:type="dxa"/>
+            <w:vAlign w:val="center"/>
+          </w:tcPr>
+          <w:p>
+            <w:pPr>
+              <w:jc w:val="center"/>
+            </w:pPr>
+            <w:r>
               <w:t>192</w:t>
             </w:r>
           </w:p>
@@ -1377,28 +1150,25 @@
       <w:tr>
         <w:tc>
           <w:tcPr>
-            <w:tcW w:w="4508" w:type="dxa"/>
-            <w:vAlign w:val="center"/>
-          </w:tcPr>
-          <w:p>
-            <w:r>
-              <w:rPr>
-                <w:b w:val="0"/>
-              </w:rPr>
+            <w:tcW w:w="3256" w:type="dxa"/>
+            <w:vAlign w:val="center"/>
+          </w:tcPr>
+          <w:p>
+            <w:r>
               <w:t>Wrong Diameter</w:t>
             </w:r>
           </w:p>
         </w:tc>
         <w:tc>
           <w:tcPr>
-            <w:tcW w:w="4508" w:type="dxa"/>
-            <w:vAlign w:val="center"/>
-          </w:tcPr>
-          <w:p>
-            <w:r>
-              <w:rPr>
-                <w:b w:val="0"/>
-              </w:rPr>
+            <w:tcW w:w="2268" w:type="dxa"/>
+            <w:vAlign w:val="center"/>
+          </w:tcPr>
+          <w:p>
+            <w:pPr>
+              <w:jc w:val="center"/>
+            </w:pPr>
+            <w:r>
               <w:t>170</w:t>
             </w:r>
           </w:p>
@@ -1407,28 +1177,25 @@
       <w:tr>
         <w:tc>
           <w:tcPr>
-            <w:tcW w:w="4508" w:type="dxa"/>
-            <w:vAlign w:val="center"/>
-          </w:tcPr>
-          <w:p>
-            <w:r>
-              <w:rPr>
-                <w:b w:val="0"/>
-              </w:rPr>
+            <w:tcW w:w="3256" w:type="dxa"/>
+            <w:vAlign w:val="center"/>
+          </w:tcPr>
+          <w:p>
+            <w:r>
               <w:t>Wrong Role Classification</w:t>
             </w:r>
           </w:p>
         </w:tc>
         <w:tc>
           <w:tcPr>
-            <w:tcW w:w="4508" w:type="dxa"/>
-            <w:vAlign w:val="center"/>
-          </w:tcPr>
-          <w:p>
-            <w:r>
-              <w:rPr>
-                <w:b w:val="0"/>
-              </w:rPr>
+            <w:tcW w:w="2268" w:type="dxa"/>
+            <w:vAlign w:val="center"/>
+          </w:tcPr>
+          <w:p>
+            <w:pPr>
+              <w:jc w:val="center"/>
+            </w:pPr>
+            <w:r>
               <w:t>62</w:t>
             </w:r>
           </w:p>
@@ -1437,28 +1204,25 @@
       <w:tr>
         <w:tc>
           <w:tcPr>
-            <w:tcW w:w="4508" w:type="dxa"/>
-            <w:vAlign w:val="center"/>
-          </w:tcPr>
-          <w:p>
-            <w:r>
-              <w:rPr>
-                <w:b w:val="0"/>
-              </w:rPr>
+            <w:tcW w:w="3256" w:type="dxa"/>
+            <w:vAlign w:val="center"/>
+          </w:tcPr>
+          <w:p>
+            <w:r>
               <w:t>Beam Missing</w:t>
             </w:r>
           </w:p>
         </w:tc>
         <w:tc>
           <w:tcPr>
-            <w:tcW w:w="4508" w:type="dxa"/>
-            <w:vAlign w:val="center"/>
-          </w:tcPr>
-          <w:p>
-            <w:r>
-              <w:rPr>
-                <w:b w:val="0"/>
-              </w:rPr>
+            <w:tcW w:w="2268" w:type="dxa"/>
+            <w:vAlign w:val="center"/>
+          </w:tcPr>
+          <w:p>
+            <w:pPr>
+              <w:jc w:val="center"/>
+            </w:pPr>
+            <w:r>
               <w:t>9</w:t>
             </w:r>
           </w:p>
@@ -1467,26 +1231,23 @@
       <w:tr>
         <w:tc>
           <w:tcPr>
-            <w:tcW w:type="dxa" w:w="4508"/>
-          </w:tcPr>
-          <w:p>
-            <w:r>
-              <w:rPr>
-                <w:b w:val="0"/>
-              </w:rPr>
+            <w:tcW w:w="3256" w:type="dxa"/>
+          </w:tcPr>
+          <w:p>
+            <w:r>
               <w:t>Beam Mismatch</w:t>
             </w:r>
           </w:p>
         </w:tc>
         <w:tc>
           <w:tcPr>
-            <w:tcW w:type="dxa" w:w="4508"/>
-          </w:tcPr>
-          <w:p>
-            <w:r>
-              <w:rPr>
-                <w:b w:val="0"/>
-              </w:rPr>
+            <w:tcW w:w="2268" w:type="dxa"/>
+          </w:tcPr>
+          <w:p>
+            <w:pPr>
+              <w:jc w:val="center"/>
+            </w:pPr>
+            <w:r>
               <w:t>4</w:t>
             </w:r>
           </w:p>
@@ -1495,26 +1256,23 @@
       <w:tr>
         <w:tc>
           <w:tcPr>
-            <w:tcW w:type="dxa" w:w="4508"/>
-          </w:tcPr>
-          <w:p>
-            <w:r>
-              <w:rPr>
-                <w:b w:val="0"/>
-              </w:rPr>
+            <w:tcW w:w="3256" w:type="dxa"/>
+          </w:tcPr>
+          <w:p>
+            <w:r>
               <w:t>Steel Difference</w:t>
             </w:r>
           </w:p>
         </w:tc>
         <w:tc>
           <w:tcPr>
-            <w:tcW w:type="dxa" w:w="4508"/>
-          </w:tcPr>
-          <w:p>
-            <w:r>
-              <w:rPr>
-                <w:b w:val="0"/>
-              </w:rPr>
+            <w:tcW w:w="2268" w:type="dxa"/>
+          </w:tcPr>
+          <w:p>
+            <w:pPr>
+              <w:jc w:val="center"/>
+            </w:pPr>
+            <w:r>
               <w:t>2</w:t>
             </w:r>
           </w:p>
@@ -1549,81 +1307,41 @@
     </w:p>
     <w:p>
       <w:r>
-        <w:rPr>
-          <w:b w:val="0"/>
-        </w:rPr>
         <w:t>Since the Version 8.9.1 baseline, the Version 9 engineering programme has delivered the following major capabilities that are now included in the regenerated benchmark:</w:t>
       </w:r>
     </w:p>
     <w:p>
       <w:r>
-        <w:rPr>
-          <w:b w:val="0"/>
-        </w:rPr>
         <w:t>• Stirrup Recovery Engine</w:t>
       </w:r>
     </w:p>
     <w:p>
       <w:r>
-        <w:rPr>
-          <w:b w:val="0"/>
-        </w:rPr>
         <w:t>• OpenCV geometric evidence pipeline</w:t>
       </w:r>
     </w:p>
     <w:p>
       <w:r>
-        <w:rPr>
-          <w:b w:val="0"/>
-        </w:rPr>
         <w:t>• Beam Ownership Engine</w:t>
       </w:r>
     </w:p>
     <w:p>
       <w:r>
-        <w:rPr>
-          <w:b w:val="0"/>
-        </w:rPr>
         <w:t>• Annotation Graph Resolver</w:t>
       </w:r>
     </w:p>
     <w:p>
       <w:r>
-        <w:rPr>
-          <w:b w:val="0"/>
-        </w:rPr>
         <w:t>• Adaptive Render Extent</w:t>
       </w:r>
     </w:p>
     <w:p>
       <w:r>
-        <w:rPr>
-          <w:b w:val="0"/>
-        </w:rPr>
-        <w:t>• Shared Engineering Ownership</w:t>
-      </w:r>
-    </w:p>
-    <w:p>
-      <w:r>
-        <w:rPr>
-          <w:b w:val="0"/>
-        </w:rPr>
-        <w:t>• Shared Scope Deduplication</w:t>
-      </w:r>
-    </w:p>
-    <w:p>
-      <w:r>
-        <w:rPr>
-          <w:b w:val="0"/>
-        </w:rPr>
         <w:t>• End-to-End Pipeline Integration (QA.2B.0)</w:t>
       </w:r>
     </w:p>
     <w:p>
       <w:r>
-        <w:rPr>
-          <w:b w:val="0"/>
-        </w:rPr>
         <w:t>• Production Output Regeneration (QA.2B.1)</w:t>
       </w:r>
     </w:p>
@@ -1645,57 +1363,41 @@
     </w:p>
     <w:p>
       <w:pPr>
+        <w:pStyle w:val="ListParagraph"/>
         <w:numPr>
           <w:ilvl w:val="0"/>
-          <w:numId w:val="5"/>
+          <w:numId w:val="6"/>
         </w:numPr>
-        <w:jc w:val="both"/>
-      </w:pPr>
-      <w:r>
-        <w:t>Beam detection remains highly reliable at 93.92%, confirming that beam discovery is largely stable across all three drawing sets.</w:t>
-      </w:r>
-    </w:p>
-    <w:p>
-      <w:pPr>
+      </w:pPr>
+      <w:r>
+        <w:t>Reinforcement interpretation has improved substantially: bar detection rose to 68.52% (from 41.52%), and bar matching accuracy to 27.41% (from 24.16%).</w:t>
+      </w:r>
+    </w:p>
+    <w:p>
+      <w:pPr>
+        <w:pStyle w:val="ListParagraph"/>
         <w:numPr>
           <w:ilvl w:val="0"/>
-          <w:numId w:val="5"/>
+          <w:numId w:val="6"/>
         </w:numPr>
-        <w:jc w:val="both"/>
-      </w:pPr>
-      <w:r>
-        <w:t>Steel estimation accuracy has improved significantly to 91.07% (from 72.69% in Version 8.9.1).</w:t>
-      </w:r>
-    </w:p>
-    <w:p>
-      <w:r>
-        <w:t>Reinforcement interpretation has improved substantially: bar detection rose to 68.52% (from 41.52%), and bar matching accuracy to 27.41% (from 24.16%).</w:t>
-      </w:r>
-    </w:p>
-    <w:p>
-      <w:r>
-        <w:rPr>
-          <w:b w:val="0"/>
-        </w:rPr>
+      </w:pPr>
+      <w:r>
         <w:t>The Third drawing set remains the primary benchmark challenge, with the lowest bar matching accuracy among the three sets.</w:t>
       </w:r>
     </w:p>
     <w:p>
-      <w:r>
-        <w:rPr>
-          <w:b w:val="0"/>
-        </w:rPr>
+      <w:pPr>
+        <w:pStyle w:val="ListParagraph"/>
+        <w:numPr>
+          <w:ilvl w:val="0"/>
+          <w:numId w:val="6"/>
+        </w:numPr>
+      </w:pPr>
+      <w:r>
         <w:t>Remaining work should focus on reinforcement interpretation, continuous bars, diameter resolution, and complex shared beam annotations.</w:t>
       </w:r>
     </w:p>
-    <w:p>
-      <w:r>
-        <w:rPr>
-          <w:b w:val="0"/>
-        </w:rPr>
-        <w:t>Overall ground-truth benchmark accuracy is now 70.23%, an improvement of +12.16% versus Version 8.9.1.</w:t>
-      </w:r>
-    </w:p>
+    <w:p/>
     <w:sectPr>
       <w:pgSz w:w="11906" w:h="16838"/>
       <w:pgMar w:top="1440" w:right="1440" w:bottom="1440" w:left="1440" w:header="708" w:footer="708" w:gutter="0"/>
@@ -2453,6 +2155,119 @@
       </w:rPr>
     </w:lvl>
   </w:abstractNum>
+  <w:abstractNum w:abstractNumId="5" w15:restartNumberingAfterBreak="0">
+    <w:nsid w:val="6D9B1658"/>
+    <w:multiLevelType w:val="hybridMultilevel"/>
+    <w:tmpl w:val="9FFE5EB2"/>
+    <w:lvl w:ilvl="0" w:tplc="40090001">
+      <w:start w:val="1"/>
+      <w:numFmt w:val="bullet"/>
+      <w:lvlText w:val=""/>
+      <w:lvlJc w:val="left"/>
+      <w:pPr>
+        <w:ind w:left="720" w:hanging="360"/>
+      </w:pPr>
+      <w:rPr>
+        <w:rFonts w:ascii="Symbol" w:hAnsi="Symbol" w:hint="default"/>
+      </w:rPr>
+    </w:lvl>
+    <w:lvl w:ilvl="1" w:tplc="40090003" w:tentative="1">
+      <w:start w:val="1"/>
+      <w:numFmt w:val="bullet"/>
+      <w:lvlText w:val="o"/>
+      <w:lvlJc w:val="left"/>
+      <w:pPr>
+        <w:ind w:left="1440" w:hanging="360"/>
+      </w:pPr>
+      <w:rPr>
+        <w:rFonts w:ascii="Courier New" w:hAnsi="Courier New" w:cs="Courier New" w:hint="default"/>
+      </w:rPr>
+    </w:lvl>
+    <w:lvl w:ilvl="2" w:tplc="40090005" w:tentative="1">
+      <w:start w:val="1"/>
+      <w:numFmt w:val="bullet"/>
+      <w:lvlText w:val=""/>
+      <w:lvlJc w:val="left"/>
+      <w:pPr>
+        <w:ind w:left="2160" w:hanging="360"/>
+      </w:pPr>
+      <w:rPr>
+        <w:rFonts w:ascii="Wingdings" w:hAnsi="Wingdings" w:hint="default"/>
+      </w:rPr>
+    </w:lvl>
+    <w:lvl w:ilvl="3" w:tplc="40090001" w:tentative="1">
+      <w:start w:val="1"/>
+      <w:numFmt w:val="bullet"/>
+      <w:lvlText w:val=""/>
+      <w:lvlJc w:val="left"/>
+      <w:pPr>
+        <w:ind w:left="2880" w:hanging="360"/>
+      </w:pPr>
+      <w:rPr>
+        <w:rFonts w:ascii="Symbol" w:hAnsi="Symbol" w:hint="default"/>
+      </w:rPr>
+    </w:lvl>
+    <w:lvl w:ilvl="4" w:tplc="40090003" w:tentative="1">
+      <w:start w:val="1"/>
+      <w:numFmt w:val="bullet"/>
+      <w:lvlText w:val="o"/>
+      <w:lvlJc w:val="left"/>
+      <w:pPr>
+        <w:ind w:left="3600" w:hanging="360"/>
+      </w:pPr>
+      <w:rPr>
+        <w:rFonts w:ascii="Courier New" w:hAnsi="Courier New" w:cs="Courier New" w:hint="default"/>
+      </w:rPr>
+    </w:lvl>
+    <w:lvl w:ilvl="5" w:tplc="40090005" w:tentative="1">
+      <w:start w:val="1"/>
+      <w:numFmt w:val="bullet"/>
+      <w:lvlText w:val=""/>
+      <w:lvlJc w:val="left"/>
+      <w:pPr>
+        <w:ind w:left="4320" w:hanging="360"/>
+      </w:pPr>
+      <w:rPr>
+        <w:rFonts w:ascii="Wingdings" w:hAnsi="Wingdings" w:hint="default"/>
+      </w:rPr>
+    </w:lvl>
+    <w:lvl w:ilvl="6" w:tplc="40090001" w:tentative="1">
+      <w:start w:val="1"/>
+      <w:numFmt w:val="bullet"/>
+      <w:lvlText w:val=""/>
+      <w:lvlJc w:val="left"/>
+      <w:pPr>
+        <w:ind w:left="5040" w:hanging="360"/>
+      </w:pPr>
+      <w:rPr>
+        <w:rFonts w:ascii="Symbol" w:hAnsi="Symbol" w:hint="default"/>
+      </w:rPr>
+    </w:lvl>
+    <w:lvl w:ilvl="7" w:tplc="40090003" w:tentative="1">
+      <w:start w:val="1"/>
+      <w:numFmt w:val="bullet"/>
+      <w:lvlText w:val="o"/>
+      <w:lvlJc w:val="left"/>
+      <w:pPr>
+        <w:ind w:left="5760" w:hanging="360"/>
+      </w:pPr>
+      <w:rPr>
+        <w:rFonts w:ascii="Courier New" w:hAnsi="Courier New" w:cs="Courier New" w:hint="default"/>
+      </w:rPr>
+    </w:lvl>
+    <w:lvl w:ilvl="8" w:tplc="40090005" w:tentative="1">
+      <w:start w:val="1"/>
+      <w:numFmt w:val="bullet"/>
+      <w:lvlText w:val=""/>
+      <w:lvlJc w:val="left"/>
+      <w:pPr>
+        <w:ind w:left="6480" w:hanging="360"/>
+      </w:pPr>
+      <w:rPr>
+        <w:rFonts w:ascii="Wingdings" w:hAnsi="Wingdings" w:hint="default"/>
+      </w:rPr>
+    </w:lvl>
+  </w:abstractNum>
   <w:num w:numId="1" w16cid:durableId="2132167116">
     <w:abstractNumId w:val="1"/>
   </w:num>
@@ -2467,6 +2282,9 @@
   </w:num>
   <w:num w:numId="5" w16cid:durableId="319310739">
     <w:abstractNumId w:val="0"/>
+  </w:num>
+  <w:num w:numId="6" w16cid:durableId="1623880557">
+    <w:abstractNumId w:val="5"/>
   </w:num>
 </w:numbering>
 </file>

</xml_diff>